<commit_message>
Remove Sapphire Moon from resume and portfolio
</commit_message>
<xml_diff>
--- a/assets/Ding-Ma-Resume.docx
+++ b/assets/Ding-Ma-Resume.docx
@@ -606,119 +606,6 @@
           <w:sz w:val="21"/>
           <w:szCs w:val="21"/>
         </w:rPr>
-        <w:t xml:space="preserve">Sapphire </w:t>
-      </w:r>
-      <w:r>
-        <w:rPr>
-          <w:b/>
-          <w:sz w:val="21"/>
-          <w:szCs w:val="21"/>
-        </w:rPr>
-        <w:t>Moon</w:t>
-      </w:r>
-      <w:r>
-        <w:rPr>
-          <w:rStyle w:val="CommentReference"/>
-          <w:sz w:val="21"/>
-          <w:szCs w:val="21"/>
-        </w:rPr>
-      </w:r>
-      <w:r>
-        <w:rPr>
-          <w:b/>
-        </w:rPr>
-        <w:tab/>
-        <w:t>Sacramento, CA</w:t>
-      </w:r>
-    </w:p>
-    <w:p>
-      <w:pPr>
-        <w:keepNext/>
-        <w:tabs>
-          <w:tab w:val="right" w:pos="10800"/>
-        </w:tabs>
-        <w:rPr>
-          <w:sz w:val="21"/>
-          <w:szCs w:val="21"/>
-        </w:rPr>
-      </w:pPr>
-      <w:r>
-        <w:rPr>
-          <w:sz w:val="21"/>
-          <w:szCs w:val="21"/>
-        </w:rPr>
-        <w:t>Co-founder, Ragdoll Cattery</w:t>
-      </w:r>
-      <w:r>
-        <w:rPr>
-          <w:sz w:val="21"/>
-          <w:szCs w:val="21"/>
-        </w:rPr>
-        <w:tab/>
-        <w:t>09/2021 - 12/2024</w:t>
-      </w:r>
-    </w:p>
-    <w:p>
-      <w:pPr>
-        <w:keepLines/>
-        <w:tabs>
-          <w:tab w:val="left" w:pos="360"/>
-        </w:tabs>
-        <w:ind w:left="360" w:hanging="360"/>
-        <w:rPr>
-          <w:sz w:val="21"/>
-          <w:szCs w:val="21"/>
-        </w:rPr>
-      </w:pPr>
-      <w:r>
-        <w:rPr>
-          <w:sz w:val="21"/>
-          <w:szCs w:val="21"/>
-        </w:rPr>
-        <w:t>•</w:t>
-      </w:r>
-      <w:r>
-        <w:rPr>
-          <w:sz w:val="21"/>
-          <w:szCs w:val="21"/>
-        </w:rPr>
-        <w:tab/>
-        <w:t xml:space="preserve">Co-founded and operated a TICA-certified Ragdoll cattery; managed daily care routines and customer communication for </w:t>
-      </w:r>
-      <w:r>
-        <w:rPr>
-          <w:sz w:val="21"/>
-          <w:szCs w:val="21"/>
-        </w:rPr>
-        <w:t>approximately 50 cats and 50 customers</w:t>
-      </w:r>
-    </w:p>
-    <w:p>
-      <w:pPr>
-        <w:keepNext/>
-        <w:rPr>
-          <w:sz w:val="21"/>
-          <w:szCs w:val="21"/>
-        </w:rPr>
-      </w:pPr>
-    </w:p>
-    <w:p>
-      <w:pPr>
-        <w:keepNext/>
-        <w:tabs>
-          <w:tab w:val="right" w:pos="10800"/>
-        </w:tabs>
-        <w:rPr>
-          <w:sz w:val="21"/>
-          <w:szCs w:val="21"/>
-        </w:rPr>
-      </w:pPr>
-      <w:r>
-        <w:rPr>
-          <w:b/>
-          <w:sz w:val="21"/>
-          <w:szCs w:val="21"/>
-        </w:rPr>
         <w:t>Tencent</w:t>
       </w:r>
       <w:r>

</xml_diff>